<commit_message>
Redline tailors the headline, summary, bullets, and skills to the posting (#152)
One edit shape and one validator replace edits and skills_edits; flags are
comment-only proposals; the template is rewritten; the example resume gains a
headline.

Co-Authored-By: WOZCODE <contact@withwoz.com>
</commit_message>
<xml_diff>
--- a/profile.example/resume.docx
+++ b/profile.example/resume.docx
@@ -13,6 +13,11 @@
     <w:p>
       <w:r>
         <w:t>Chicago, IL | jordan@example.com | example.com/jordan</w:t>
+      </w:r>
+    </w:p>
+    <w:p>
+      <w:r>
+        <w:t>Analytics engineer for e-commerce and logistics teams</w:t>
       </w:r>
     </w:p>
     <w:p>

</xml_diff>